<commit_message>
Implementa validación trazable de minuta y poderes
</commit_message>
<xml_diff>
--- a/Conocimiento/Minutas/Minuta_hipoteca.docx
+++ b/Conocimiento/Minutas/Minuta_hipoteca.docx
@@ -61,20 +61,47 @@
       </w:r>
     </w:p>
     <w:p>
-      <w:pPr>
-        <w:jc w:val="both"/>
-      </w:pPr>
-      <w:r>
-        <w:rPr>
-          <w:rFonts w:ascii="Arial" w:cs="Arial" w:eastAsia="Arial" w:hAnsi="Arial"/>
-          <w:b w:val="1"/>
-          <w:bCs w:val="1"/>
-          <w:rtl w:val="0"/>
-        </w:rPr>
-        <w:t>[INCLUIR ÚNICAMENTE CUANDO Consentimiento_Conyuge_Hipoteca = Sí] Acto seguido comparece {{CONYUGE_CONSENTIDOR_NOMBRE}}, mayor de edad, identificado(a) con {{CONYUGE_CONSENTIDOR_TIPO_DOCUMENTO}} número {{CONYUGE_CONSENTIDOR_NUMERO_DOCUMENTO}} expedido(a) en {{CONYUGE_CONSENTIDOR_LUGAR_EXPEDICION}}, quien suscribe el presente instrumento público para expresar su consentimiento en la constitución de la garantía hipotecaria que, a favor de ECOPETROL S.A., ha realizado {{HIPOTECANTE_NOMBRE}}, al haberse afectado el inmueble adquirido a vivienda familiar.</w:t>
-      </w:r>
-    </w:p>
-    <w:p>
+      <w:bookmarkStart w:id="1" w:name="MIN_COND_CONYUGE"/>
+      <w:pPr>
+        <w:jc w:val="both"/>
+      </w:pPr>
+      <w:r>
+        <w:rPr>
+          <w:rFonts w:ascii="Arial" w:cs="Arial" w:eastAsia="Arial" w:hAnsi="Arial"/>
+          <w:b w:val="1"/>
+          <w:bCs w:val="1"/>
+          <w:rtl w:val="0"/>
+        </w:rPr>
+        <w:rPr>
+          <w:rFonts w:ascii="Arial" w:cs="Arial" w:eastAsia="Arial" w:hAnsi="Arial"/>
+          <w:b w:val="1"/>
+          <w:bCs w:val="1"/>
+          <w:rtl w:val="0"/>
+        </w:rPr>
+        <w:t>{{#SI_CONSENTIMIENTO_CONYUGE}}</w:t>
+      </w:r>
+      <w:r>
+        <w:rPr>
+          <w:rFonts w:ascii="Arial" w:cs="Arial" w:eastAsia="Arial" w:hAnsi="Arial"/>
+          <w:b w:val="1"/>
+          <w:bCs w:val="1"/>
+          <w:rtl w:val="0"/>
+        </w:rPr>
+        <w:t>Acto seguido comparece {{CONYUGE_CONSENTIDOR_NOMBRE}}, mayor de edad, identificado(a) con {{CONYUGE_CONSENTIDOR_TIPO_DOCUMENTO}} número {{CONYUGE_CONSENTIDOR_NUMERO_DOCUMENTO}} expedido(a) en {{CONYUGE_CONSENTIDOR_LUGAR_EXPEDICION}}, quien suscribe el presente instrumento público para expresar su consentimiento en la constitución de la garantía hipotecaria que, a favor de ECOPETROL S.A., ha realizado {{HIPOTECANTE_NOMBRE}}, al haberse afectado el inmueble adquirido a vivienda familiar.</w:t>
+      </w:r>
+      <w:r>
+        <w:rPr>
+          <w:rFonts w:ascii="Arial" w:cs="Arial" w:eastAsia="Arial" w:hAnsi="Arial"/>
+          <w:b w:val="1"/>
+          <w:bCs w:val="1"/>
+          <w:rtl w:val="0"/>
+        </w:rPr>
+        <w:t>{{/SI_CONSENTIMIENTO_CONYUGE}}</w:t>
+      </w:r>
+      <w:bookmarkEnd w:id="1"/>
+    </w:p>
+    <w:p>
+      <w:bookmarkStart w:id="2" w:name="MIN_COMPARECENCIA_HIPOTECANTE"/>
       <w:pPr>
         <w:tabs>
           <w:tab w:val="left" w:leader="none" w:pos="720"/>
@@ -106,6 +133,7 @@
         </w:rPr>
         <w:t>Compareció {{HIPOTECANTE_NOMBRE}}, mayor de edad, vecino y domiciliado en {{HIPOTECANTE_DOMICILIO_CIUDAD}} ({{HIPOTECANTE_DOMICILIO_DEPARTAMENTO}}), identificado con la {{HIPOTECANTE_TIPO_DOCUMENTO}} número {{HIPOTECANTE_NUMERO_DOCUMENTO}} expedida en {{HIPOTECANTE_LUGAR_EXPEDICION}} de estado civil {{HIPOTECANTE_ESTADO_CIVIL}}, obrando en nombre propio, quien en adelante se llamará LA PARTE HIPOTECANTE y manifestó (aron):</w:t>
       </w:r>
+      <w:bookmarkEnd w:id="2"/>
     </w:p>
     <w:p>
       <w:pPr>
@@ -137,6 +165,7 @@
       </w:r>
     </w:p>
     <w:p>
+      <w:bookmarkStart w:id="3" w:name="MIN_CLA_001"/>
       <w:pPr>
         <w:tabs>
           <w:tab w:val="left" w:leader="none" w:pos="720"/>
@@ -336,6 +365,7 @@
           <w:rtl w:val="0"/>
         </w:rPr>
       </w:r>
+      <w:bookmarkEnd w:id="3"/>
     </w:p>
     <w:p>
       <w:pPr>
@@ -426,6 +456,7 @@
       </w:r>
     </w:p>
     <w:p>
+      <w:bookmarkStart w:id="4" w:name="MIN_CLA_001_PAR_1"/>
       <w:pPr>
         <w:tabs>
           <w:tab w:val="left" w:leader="none" w:pos="720"/>
@@ -468,6 +499,7 @@
         </w:rPr>
         <w:t>La hipoteca que se constituye por medio de este instrumento, se extiende también a las anexidades, mejoras y edificaciones que existan en la actualidad en los inmuebles que se han alinderado y los que existan en el futuro en ellos y se extiende a cualesquiera indemnizaciones que puedan corresponder a los exponentes por razón del dominio de los bienes hipotecados, como las provenientes de cualquier seguro que ampare los inmuebles o sus anexidades.</w:t>
       </w:r>
+      <w:bookmarkEnd w:id="4"/>
     </w:p>
     <w:p>
       <w:pPr>
@@ -501,6 +533,7 @@
       </w:r>
     </w:p>
     <w:p>
+      <w:bookmarkStart w:id="5" w:name="MIN_CLA_001_PAR_2"/>
       <w:pPr>
         <w:jc w:val="both"/>
       </w:pPr>
@@ -515,8 +548,10 @@
         </w:rPr>
         <w:t>PARÁGRAFO SEGUNDO. LINDEROS GENERALES: {{LINDEROS_GENERALES_PH}}</w:t>
       </w:r>
-    </w:p>
-    <w:p>
+      <w:bookmarkEnd w:id="5"/>
+    </w:p>
+    <w:p>
+      <w:bookmarkStart w:id="6" w:name="MIN_CLA_001_PAR_3"/>
       <w:pPr>
         <w:tabs>
           <w:tab w:val="left" w:leader="none" w:pos="3600"/>
@@ -548,6 +583,7 @@
         </w:rPr>
         <w:t>PARÁGRAFO TERCERO. PROPIEDAD HORIZONTAL: El inmueble materia del presente acto se encuentra sometido al régimen de propiedad horizontal constituido y/o modificado mediante {{REFERENCIA_REGLAMENTO_PH}}, debidamente registrado.</w:t>
       </w:r>
+      <w:bookmarkEnd w:id="6"/>
     </w:p>
     <w:p>
       <w:pPr>
@@ -689,6 +725,7 @@
       </w:r>
     </w:p>
     <w:p>
+      <w:bookmarkStart w:id="7" w:name="MIN_CLA_002"/>
       <w:pPr>
         <w:tabs>
           <w:tab w:val="left" w:leader="none" w:pos="720"/>
@@ -883,6 +920,7 @@
         </w:rPr>
         <w:t xml:space="preserve">en los términos anteriormente convenidos, con independencia del título o documento en el que consten. </w:t>
       </w:r>
+      <w:bookmarkEnd w:id="7"/>
     </w:p>
     <w:p>
       <w:pPr>
@@ -914,6 +952,7 @@
       </w:r>
     </w:p>
     <w:p>
+      <w:bookmarkStart w:id="8" w:name="MIN_CLA_003"/>
       <w:pPr>
         <w:tabs>
           <w:tab w:val="left" w:leader="none" w:pos="720"/>
@@ -1069,6 +1108,7 @@
         </w:rPr>
         <w:t>no sólo las obligaciones contraídas con posterioridad a la constitución del presente gravamen, sino las que se contraigan en lo sucesivo hasta su total cancelación o las que se hubieren constituido hasta la fecha.</w:t>
       </w:r>
+      <w:bookmarkEnd w:id="8"/>
     </w:p>
     <w:p>
       <w:pPr>
@@ -1100,6 +1140,7 @@
       </w:r>
     </w:p>
     <w:p>
+      <w:bookmarkStart w:id="9" w:name="MIN_CLA_003_PAR_1"/>
       <w:pPr>
         <w:tabs>
           <w:tab w:val="left" w:leader="none" w:pos="720"/>
@@ -1189,6 +1230,7 @@
         </w:rPr>
         <w:t xml:space="preserve"> </w:t>
       </w:r>
+      <w:bookmarkEnd w:id="9"/>
     </w:p>
     <w:p>
       <w:pPr>
@@ -1223,6 +1265,7 @@
       </w:r>
     </w:p>
     <w:p>
+      <w:bookmarkStart w:id="10" w:name="MIN_CLA_003_PAR_2"/>
       <w:pPr>
         <w:tabs>
           <w:tab w:val="left" w:leader="none" w:pos="720"/>
@@ -1412,6 +1455,7 @@
         </w:rPr>
         <w:t xml:space="preserve"> la(s) cual(es) se protocoliza(n) con este instrumento, todo ello de conformidad con las normas fiscales vigentes.</w:t>
       </w:r>
+      <w:bookmarkEnd w:id="10"/>
     </w:p>
     <w:p>
       <w:pPr>
@@ -1443,6 +1487,7 @@
       </w:r>
     </w:p>
     <w:p>
+      <w:bookmarkStart w:id="11" w:name="MIN_CLA_003_PAR_3"/>
       <w:pPr>
         <w:tabs>
           <w:tab w:val="left" w:leader="none" w:pos="720"/>
@@ -1546,6 +1591,7 @@
         </w:rPr>
         <w:t>se extienda en el caso de una dación en pago del (los) inmueble (s) gravado (s), hasta por el valor total por el cual se convenga la dación en pago; en el caso de proceso judicial o en aquel en el cual el (los) inmueble (s) gravado (s) sea (n) rematado (s), hasta por el valor total del (de los ) bien (es) gravado (s), según el caso, en cualquier otra circunstancia o evento, hasta por el valor comercial del (los) inmueble (s) gravado (s), siempre y cuando se presente esta otra circunstancia o evento</w:t>
       </w:r>
+      <w:bookmarkEnd w:id="11"/>
     </w:p>
     <w:p>
       <w:pPr>
@@ -1577,6 +1623,7 @@
       </w:r>
     </w:p>
     <w:p>
+      <w:bookmarkStart w:id="12" w:name="MIN_CLA_004"/>
       <w:pPr>
         <w:tabs>
           <w:tab w:val="left" w:leader="none" w:pos="3600"/>
@@ -1678,6 +1725,7 @@
           <w:rtl w:val="0"/>
         </w:rPr>
       </w:r>
+      <w:bookmarkEnd w:id="12"/>
     </w:p>
     <w:p>
       <w:pPr>
@@ -1711,6 +1759,7 @@
       </w:r>
     </w:p>
     <w:p>
+      <w:bookmarkStart w:id="13" w:name="MIN_CLA_005"/>
       <w:pPr>
         <w:tabs>
           <w:tab w:val="left" w:leader="none" w:pos="720"/>
@@ -1818,6 +1867,7 @@
         </w:rPr>
         <w:t>.</w:t>
       </w:r>
+      <w:bookmarkEnd w:id="13"/>
     </w:p>
     <w:p>
       <w:pPr>
@@ -1851,6 +1901,7 @@
       </w:r>
     </w:p>
     <w:p>
+      <w:bookmarkStart w:id="14" w:name="MIN_CLA_006"/>
       <w:pPr>
         <w:tabs>
           <w:tab w:val="left" w:leader="none" w:pos="720"/>
@@ -1905,6 +1956,7 @@
         </w:rPr>
         <w:t>Son requisitos para el desembolso total o parcial de cualquier crédito aprobado los siguientes:</w:t>
       </w:r>
+      <w:bookmarkEnd w:id="14"/>
     </w:p>
     <w:p>
       <w:pPr>
@@ -2354,6 +2406,7 @@
       </w:r>
     </w:p>
     <w:p>
+      <w:bookmarkStart w:id="15" w:name="MIN_CLA_007"/>
       <w:pPr>
         <w:tabs>
           <w:tab w:val="left" w:leader="none" w:pos="720"/>
@@ -2448,6 +2501,7 @@
         </w:rPr>
         <w:t>cuando se presente, en relación con cualquiera de aquellas, alguna de las siguientes causales:</w:t>
       </w:r>
+      <w:bookmarkEnd w:id="15"/>
     </w:p>
     <w:p>
       <w:pPr>
@@ -3293,6 +3347,7 @@
       </w:r>
     </w:p>
     <w:p>
+      <w:bookmarkStart w:id="16" w:name="MIN_CLA_008"/>
       <w:pPr>
         <w:tabs>
           <w:tab w:val="left" w:leader="none" w:pos="720"/>
@@ -3346,6 +3401,7 @@
         </w:rPr>
         <w:t xml:space="preserve"> - Que será (n) de cargo del (los) exponente (s) deudor (es) los gastos de cobro judicial o extrajudicial de la deuda si a ello hubiere lugar incluyendo en estos los honorarios del abogado que se encargue de la cobranza, los de otorgamiento de esta escritura, los de un certificado de tradición ampliado con hipoteca y los de su cancelación llegado el caso.</w:t>
       </w:r>
+      <w:bookmarkEnd w:id="16"/>
     </w:p>
     <w:p>
       <w:pPr>
@@ -3377,6 +3433,7 @@
       </w:r>
     </w:p>
     <w:p>
+      <w:bookmarkStart w:id="17" w:name="MIN_CLA_009"/>
       <w:pPr>
         <w:tabs>
           <w:tab w:val="left" w:leader="none" w:pos="720"/>
@@ -3491,6 +3548,7 @@
         </w:rPr>
         <w:t xml:space="preserve">y a girar a ésta los valores pignorados por concepto de capital, intereses corrientes y de mora, seguros y gastos de cobro judicial si este evento llegare a presentarse. Esta autorización se hace extensiva al cumplimiento de las estipulaciones especiales pactadas en el presente instrumento público. </w:t>
       </w:r>
+      <w:bookmarkEnd w:id="17"/>
     </w:p>
     <w:p>
       <w:pPr>
@@ -3616,6 +3674,7 @@
       </w:r>
     </w:p>
     <w:p>
+      <w:bookmarkStart w:id="18" w:name="MIN_CLA_010"/>
       <w:pPr>
         <w:tabs>
           <w:tab w:val="left" w:leader="none" w:pos="720"/>
@@ -3658,6 +3717,7 @@
         </w:rPr>
         <w:t xml:space="preserve">Sin perjuicio de las condiciones de pago y aceleración pactadas en los respectivos títulos valores que respaldan las operaciones de crédito, las partes están de acuerdo en pactar las siguientes condiciones especiales para aquellos casos en los cuales la obligación aquí respaldada sea un crédito de vivienda de empleado. Para estos efectos acuerdan observar las siguientes disposiciones: </w:t>
       </w:r>
+      <w:bookmarkEnd w:id="18"/>
     </w:p>
     <w:p>
       <w:pPr>
@@ -4820,6 +4880,7 @@
       </w:r>
     </w:p>
     <w:p>
+      <w:bookmarkStart w:id="19" w:name="MIN_CLA_011"/>
       <w:pPr>
         <w:tabs>
           <w:tab w:val="left" w:leader="none" w:pos="720"/>
@@ -4894,6 +4955,7 @@
         </w:rPr>
         <w:t xml:space="preserve">para que en el evento de pérdida o destrucción de la copia de esta escritura con mérito para exigir el cumplimiento de cualquier obligación formule al señor Notario, por medio de escritura pública y en nombre de las dos partes contratantes la solicitud de compulsar una copia sustitutiva con merito ejecutivo, en los términos de los artículos 81 del Decreto Ley 960 de 1.970, 39 del Decreto 2148 de 1983 y particularmente lo establecido en el artículo 43 de la Ley 1395 de 2010, y demás normas que las modifiquen, sustituyan, deroguen o reglamenten.  </w:t>
       </w:r>
+      <w:bookmarkEnd w:id="19"/>
     </w:p>
     <w:p>
       <w:pPr>
@@ -4925,6 +4987,7 @@
       </w:r>
     </w:p>
     <w:p>
+      <w:bookmarkStart w:id="20" w:name="MIN_CLA_012"/>
       <w:pPr>
         <w:tabs>
           <w:tab w:val="left" w:leader="none" w:pos="720"/>
@@ -5021,6 +5084,7 @@
         </w:rPr>
         <w:t>son solidarios entre sí para todos los efectos activos y pasivos que en relación con ellos produzcan los contratos a que se refiere esta escritura.</w:t>
       </w:r>
+      <w:bookmarkEnd w:id="20"/>
     </w:p>
     <w:p>
       <w:pPr>
@@ -5054,6 +5118,7 @@
       </w:r>
     </w:p>
     <w:p>
+      <w:bookmarkStart w:id="21" w:name="MIN_CLA_013"/>
       <w:pPr>
         <w:tabs>
           <w:tab w:val="left" w:leader="none" w:pos="720"/>
@@ -5168,6 +5233,7 @@
         </w:rPr>
         <w:t xml:space="preserve"> para hacer las deducciones del caso, junto con las cuotas de amortización.  El deudor acepta desde ahora cualquier modificación o reajuste de las primas que se causen por concepto de los seguros. </w:t>
       </w:r>
+      <w:bookmarkEnd w:id="21"/>
     </w:p>
     <w:p>
       <w:pPr>
@@ -5199,6 +5265,7 @@
       </w:r>
     </w:p>
     <w:p>
+      <w:bookmarkStart w:id="22" w:name="MIN_CLA_014"/>
       <w:pPr>
         <w:jc w:val="both"/>
         <w:rPr>
@@ -5335,25 +5402,27 @@
         </w:rPr>
         <w:t xml:space="preserve">. </w:t>
       </w:r>
-    </w:p>
-    <w:p>
-      <w:pPr>
-        <w:jc w:val="both"/>
-        <w:rPr>
-          <w:rFonts w:ascii="Arial" w:cs="Arial" w:eastAsia="Arial" w:hAnsi="Arial"/>
-          <w:b w:val="1"/>
-          <w:bCs w:val="1"/>
-          <w:sz w:val="24"/>
-          <w:szCs w:val="24"/>
-        </w:rPr>
-      </w:pPr>
-      <w:r>
-        <w:rPr>
-          <w:rtl w:val="0"/>
-        </w:rPr>
-      </w:r>
-    </w:p>
-    <w:p>
+      <w:bookmarkEnd w:id="22"/>
+    </w:p>
+    <w:p>
+      <w:pPr>
+        <w:jc w:val="both"/>
+        <w:rPr>
+          <w:rFonts w:ascii="Arial" w:cs="Arial" w:eastAsia="Arial" w:hAnsi="Arial"/>
+          <w:b w:val="1"/>
+          <w:bCs w:val="1"/>
+          <w:sz w:val="24"/>
+          <w:szCs w:val="24"/>
+        </w:rPr>
+      </w:pPr>
+      <w:r>
+        <w:rPr>
+          <w:rtl w:val="0"/>
+        </w:rPr>
+      </w:r>
+    </w:p>
+    <w:p>
+      <w:bookmarkStart w:id="23" w:name="MIN_PODER_ACEPTACION"/>
       <w:pPr>
         <w:jc w:val="both"/>
         <w:rPr/>
@@ -5540,6 +5609,7 @@
           <w:rtl w:val="0"/>
         </w:rPr>
       </w:r>
+      <w:bookmarkEnd w:id="23"/>
     </w:p>
     <w:p>
       <w:pPr>

</xml_diff>